<commit_message>
docs: sync portfolio with final full stack resume
</commit_message>
<xml_diff>
--- a/assets/docs/CV_Iury_Nascimento.docx
+++ b/assets/docs/CV_Iury_Nascimento.docx
@@ -11,186 +11,446 @@
         <w:rPr>
           <w:rFonts w:ascii="Arial" w:hAnsi="Arial"/>
           <w:b/>
-          <w:color w:val="1C1F24"/>
+          <w:i w:val="0"/>
+          <w:color w:val="000000"/>
           <w:sz w:val="37"/>
+          <w:u w:val="none"/>
         </w:rPr>
         <w:t>IURY HENRIQUE NASCIMENTO DE ALMEIDA</w:t>
       </w:r>
     </w:p>
     <w:p>
       <w:pPr>
-        <w:spacing w:after="40"/>
+        <w:spacing w:after="20"/>
         <w:jc w:val="center"/>
       </w:pPr>
       <w:r>
         <w:rPr>
           <w:rFonts w:ascii="Arial" w:hAnsi="Arial"/>
           <w:b/>
-          <w:color w:val="B17A0F"/>
-          <w:sz w:val="21"/>
+          <w:i w:val="0"/>
+          <w:color w:val="000000"/>
+          <w:sz w:val="22"/>
+          <w:u w:val="none"/>
         </w:rPr>
-        <w:t>Desenvolvedor Full Stack  ·  SaaS, Integrações e Automação com IA</w:t>
+        <w:t>DESENVOLVEDOR FULL STACK</w:t>
       </w:r>
     </w:p>
     <w:p>
       <w:pPr>
-        <w:spacing w:after="120"/>
+        <w:spacing w:after="50"/>
+        <w:jc w:val="center"/>
+      </w:pPr>
+      <w:r>
+        <w:rPr>
+          <w:rFonts w:ascii="Arial" w:hAnsi="Arial"/>
+          <w:b w:val="0"/>
+          <w:i w:val="0"/>
+          <w:color w:val="000000"/>
+          <w:sz w:val="18"/>
+          <w:u w:val="none"/>
+        </w:rPr>
+        <w:t>SaaS | Integrações de marketplaces | Automação de processos | IA aplicada</w:t>
+      </w:r>
+    </w:p>
+    <w:p>
+      <w:pPr>
+        <w:spacing w:after="100"/>
         <w:jc w:val="center"/>
         <w:pBdr>
-          <w:bottom w:val="single" w:sz="6" w:space="6" w:color="D7DADF"/>
+          <w:bottom w:val="single" w:sz="5" w:space="5" w:color="000000"/>
         </w:pBdr>
       </w:pPr>
       <w:r>
         <w:rPr>
           <w:rFonts w:ascii="Arial" w:hAnsi="Arial"/>
           <w:b w:val="0"/>
-          <w:color w:val="555B63"/>
+          <w:i w:val="0"/>
+          <w:color w:val="000000"/>
+          <w:sz w:val="17"/>
+          <w:u w:val="none"/>
+        </w:rPr>
+        <w:t xml:space="preserve">Nova Serrana, MG | </w:t>
+      </w:r>
+      <w:hyperlink r:id="rId9">
+        <w:r>
+          <w:rPr>
+            <w:rFonts w:ascii="Arial" w:hAnsi="Arial"/>
+            <w:color w:val="000000"/>
+            <w:u w:val="single"/>
+            <w:sz w:val="17"/>
+            <w:szCs w:val="17"/>
+          </w:rPr>
+          <w:t>iuryalmeida188@gmail.com</w:t>
+        </w:r>
+      </w:hyperlink>
+      <w:r>
+        <w:rPr>
+          <w:rFonts w:ascii="Arial" w:hAnsi="Arial"/>
+          <w:b w:val="0"/>
+          <w:i w:val="0"/>
+          <w:color w:val="000000"/>
+          <w:sz w:val="17"/>
+          <w:u w:val="none"/>
+        </w:rPr>
+        <w:t xml:space="preserve"> | </w:t>
+      </w:r>
+      <w:hyperlink r:id="rId10">
+        <w:r>
+          <w:rPr>
+            <w:rFonts w:ascii="Arial" w:hAnsi="Arial"/>
+            <w:color w:val="000000"/>
+            <w:u w:val="single"/>
+            <w:sz w:val="17"/>
+            <w:szCs w:val="17"/>
+          </w:rPr>
+          <w:t>GitHub</w:t>
+        </w:r>
+      </w:hyperlink>
+      <w:r>
+        <w:rPr>
+          <w:rFonts w:ascii="Arial" w:hAnsi="Arial"/>
+          <w:b w:val="0"/>
+          <w:i w:val="0"/>
+          <w:color w:val="000000"/>
+          <w:sz w:val="17"/>
+          <w:u w:val="none"/>
+        </w:rPr>
+        <w:t xml:space="preserve"> | </w:t>
+      </w:r>
+      <w:hyperlink r:id="rId11">
+        <w:r>
+          <w:rPr>
+            <w:rFonts w:ascii="Arial" w:hAnsi="Arial"/>
+            <w:color w:val="000000"/>
+            <w:u w:val="single"/>
+            <w:sz w:val="17"/>
+            <w:szCs w:val="17"/>
+          </w:rPr>
+          <w:t>Portfólio</w:t>
+        </w:r>
+      </w:hyperlink>
+    </w:p>
+    <w:p>
+      <w:pPr>
+        <w:pStyle w:val="Heading1"/>
+        <w:spacing w:before="120" w:after="60"/>
+        <w:pBdr>
+          <w:bottom w:val="single" w:sz="6" w:space="4" w:color="000000"/>
+        </w:pBdr>
+        <w:keepLines/>
+        <w:keepNext/>
+      </w:pPr>
+      <w:r>
+        <w:t>RESUMO PROFISSIONAL</w:t>
+      </w:r>
+    </w:p>
+    <w:p>
+      <w:pPr>
+        <w:spacing w:after="60" w:line="245" w:lineRule="auto"/>
+        <w:keepLines/>
+      </w:pPr>
+      <w:r>
+        <w:rPr>
+          <w:rFonts w:ascii="Arial" w:hAnsi="Arial"/>
+          <w:b w:val="0"/>
+          <w:i w:val="0"/>
+          <w:color w:val="000000"/>
           <w:sz w:val="18"/>
+          <w:u w:val="none"/>
         </w:rPr>
-        <w:t>Nova Serrana, MG  ·  iuryalmeida188@gmail.com  ·  github.com/iuxyOG  ·  iuxyog.github.io/iury-portfolio</w:t>
+        <w:t>Desenvolvedor Full Stack com experiência prática na construção e sustentação de sistemas SaaS que operam finanças, dados de marketplaces, geração de conteúdo com IA e processos de vendas e Customer Success. Na Value Agência, atuei como responsável técnico por quatro produtos em produção, da arquitetura e modelagem de dados ao deploy, monitoramento e correção de incidentes. Minha principal especialidade é integrar sistemas complexos e transformar rotinas manuais em software confiável, rastreável e utilizável pela operação.</w:t>
       </w:r>
     </w:p>
     <w:p>
       <w:pPr>
         <w:pStyle w:val="Heading1"/>
+        <w:spacing w:before="120" w:after="60"/>
+        <w:pBdr>
+          <w:bottom w:val="single" w:sz="6" w:space="4" w:color="000000"/>
+        </w:pBdr>
+        <w:keepLines/>
         <w:keepNext/>
-        <w:pBdr>
-          <w:bottom w:val="single" w:sz="8" w:space="4" w:color="C68A18"/>
-        </w:pBdr>
       </w:pPr>
       <w:r>
-        <w:t>PERFIL PROFISSIONAL</w:t>
+        <w:t>RESULTADOS EM DESTAQUE</w:t>
       </w:r>
     </w:p>
     <w:p>
       <w:pPr>
-        <w:spacing w:after="60" w:line="254" w:lineRule="auto"/>
-        <w:keepLines/>
-      </w:pPr>
-      <w:r>
-        <w:rPr>
-          <w:rFonts w:ascii="Arial" w:hAnsi="Arial"/>
-          <w:color w:val="1C1F24"/>
-          <w:sz w:val="19"/>
-        </w:rPr>
-        <w:t>Desenvolvedor Full Stack com atuação ponta a ponta na construção e operação de produtos SaaS para e-commerce. Entreguei plataformas financeiras, analytics multicanal, geração de anúncios com IA e automações de CRM usadas por uma operação com centenas de sellers. Trabalho com Next.js, TypeScript, Node.js, Python/FastAPI, Go, PostgreSQL, Redis e Docker, além de integrações oficiais com marketplaces. Meu foco é transformar processos manuais em produtos confiáveis, observáveis e simples de operar.</w:t>
-      </w:r>
-    </w:p>
-    <w:p>
-      <w:pPr>
-        <w:pStyle w:val="Heading1"/>
-        <w:keepNext/>
-        <w:pBdr>
-          <w:bottom w:val="single" w:sz="8" w:space="4" w:color="C68A18"/>
-        </w:pBdr>
-      </w:pPr>
-      <w:r>
-        <w:t>COMPETÊNCIAS</w:t>
-      </w:r>
-    </w:p>
-    <w:p>
-      <w:pPr>
-        <w:spacing w:after="42" w:line="245" w:lineRule="auto"/>
-        <w:ind w:left="29" w:firstLine="0"/>
+        <w:spacing w:after="36" w:line="240" w:lineRule="auto"/>
         <w:keepLines/>
       </w:pPr>
       <w:r>
         <w:rPr>
           <w:rFonts w:ascii="Arial" w:hAnsi="Arial"/>
           <w:b/>
-          <w:color w:val="B17A0F"/>
+          <w:i w:val="0"/>
+          <w:color w:val="000000"/>
           <w:sz w:val="18"/>
+          <w:u w:val="none"/>
+        </w:rPr>
+        <w:t xml:space="preserve">Escala de produto: </w:t>
+      </w:r>
+      <w:r>
+        <w:rPr>
+          <w:rFonts w:ascii="Arial" w:hAnsi="Arial"/>
+          <w:b w:val="0"/>
+          <w:i w:val="0"/>
+          <w:color w:val="000000"/>
+          <w:sz w:val="18"/>
+          <w:u w:val="none"/>
+        </w:rPr>
+        <w:t>4 produtos em produção e um SaaS de IA com mais de 400 usuários pagantes.</w:t>
+      </w:r>
+    </w:p>
+    <w:p>
+      <w:pPr>
+        <w:spacing w:after="36" w:line="240" w:lineRule="auto"/>
+        <w:keepLines/>
+      </w:pPr>
+      <w:r>
+        <w:rPr>
+          <w:rFonts w:ascii="Arial" w:hAnsi="Arial"/>
+          <w:b/>
+          <w:i w:val="0"/>
+          <w:color w:val="000000"/>
+          <w:sz w:val="18"/>
+          <w:u w:val="none"/>
+        </w:rPr>
+        <w:t xml:space="preserve">Operação: </w:t>
+      </w:r>
+      <w:r>
+        <w:rPr>
+          <w:rFonts w:ascii="Arial" w:hAnsi="Arial"/>
+          <w:b w:val="0"/>
+          <w:i w:val="0"/>
+          <w:color w:val="000000"/>
+          <w:sz w:val="18"/>
+          <w:u w:val="none"/>
+        </w:rPr>
+        <w:t>automação e suporte tecnológico para uma agência especializada em centenas de sellers.</w:t>
+      </w:r>
+    </w:p>
+    <w:p>
+      <w:pPr>
+        <w:spacing w:after="36" w:line="240" w:lineRule="auto"/>
+        <w:keepLines/>
+      </w:pPr>
+      <w:r>
+        <w:rPr>
+          <w:rFonts w:ascii="Arial" w:hAnsi="Arial"/>
+          <w:b/>
+          <w:i w:val="0"/>
+          <w:color w:val="000000"/>
+          <w:sz w:val="18"/>
+          <w:u w:val="none"/>
+        </w:rPr>
+        <w:t xml:space="preserve">Integrações: </w:t>
+      </w:r>
+      <w:r>
+        <w:rPr>
+          <w:rFonts w:ascii="Arial" w:hAnsi="Arial"/>
+          <w:b w:val="0"/>
+          <w:i w:val="0"/>
+          <w:color w:val="000000"/>
+          <w:sz w:val="18"/>
+          <w:u w:val="none"/>
+        </w:rPr>
+        <w:t>Shopee, Mercado Livre, TikTok Shop, Amazon SP-API, WhatsApp Cloud API, Bitrix24 e Eduzz.</w:t>
+      </w:r>
+    </w:p>
+    <w:p>
+      <w:pPr>
+        <w:spacing w:after="36" w:line="240" w:lineRule="auto"/>
+        <w:keepLines/>
+      </w:pPr>
+      <w:r>
+        <w:rPr>
+          <w:rFonts w:ascii="Arial" w:hAnsi="Arial"/>
+          <w:b/>
+          <w:i w:val="0"/>
+          <w:color w:val="000000"/>
+          <w:sz w:val="18"/>
+          <w:u w:val="none"/>
+        </w:rPr>
+        <w:t xml:space="preserve">Atendimento inteligente: </w:t>
+      </w:r>
+      <w:r>
+        <w:rPr>
+          <w:rFonts w:ascii="Arial" w:hAnsi="Arial"/>
+          <w:b w:val="0"/>
+          <w:i w:val="0"/>
+          <w:color w:val="000000"/>
+          <w:sz w:val="18"/>
+          <w:u w:val="none"/>
+        </w:rPr>
+        <w:t>monitoramento de 514 grupos de WhatsApp com classificação automática por IA.</w:t>
+      </w:r>
+    </w:p>
+    <w:p>
+      <w:pPr>
+        <w:pStyle w:val="Heading1"/>
+        <w:spacing w:before="120" w:after="60"/>
+        <w:pBdr>
+          <w:bottom w:val="single" w:sz="6" w:space="4" w:color="000000"/>
+        </w:pBdr>
+        <w:keepLines/>
+        <w:keepNext/>
+      </w:pPr>
+      <w:r>
+        <w:t>COMPETÊNCIAS TÉCNICAS</w:t>
+      </w:r>
+    </w:p>
+    <w:p>
+      <w:pPr>
+        <w:spacing w:after="36" w:line="240" w:lineRule="auto"/>
+        <w:keepLines/>
+      </w:pPr>
+      <w:r>
+        <w:rPr>
+          <w:rFonts w:ascii="Arial" w:hAnsi="Arial"/>
+          <w:b/>
+          <w:i w:val="0"/>
+          <w:color w:val="000000"/>
+          <w:sz w:val="18"/>
+          <w:u w:val="none"/>
         </w:rPr>
         <w:t xml:space="preserve">Frontend: </w:t>
       </w:r>
       <w:r>
         <w:rPr>
           <w:rFonts w:ascii="Arial" w:hAnsi="Arial"/>
-          <w:color w:val="1C1F24"/>
+          <w:b w:val="0"/>
+          <w:i w:val="0"/>
+          <w:color w:val="000000"/>
           <w:sz w:val="18"/>
+          <w:u w:val="none"/>
         </w:rPr>
-        <w:t>Next.js 14+, React, TypeScript, Tailwind CSS, TanStack Query, Radix UI, SSR/ISR</w:t>
+        <w:t>Next.js 14+, React, TypeScript strict, Tailwind CSS, Radix UI, TanStack Query, SSR/ISR e design systems.</w:t>
       </w:r>
     </w:p>
     <w:p>
       <w:pPr>
-        <w:spacing w:after="42" w:line="245" w:lineRule="auto"/>
-        <w:ind w:left="29" w:firstLine="0"/>
+        <w:spacing w:after="36" w:line="240" w:lineRule="auto"/>
         <w:keepLines/>
       </w:pPr>
       <w:r>
         <w:rPr>
           <w:rFonts w:ascii="Arial" w:hAnsi="Arial"/>
           <w:b/>
-          <w:color w:val="B17A0F"/>
+          <w:i w:val="0"/>
+          <w:color w:val="000000"/>
           <w:sz w:val="18"/>
+          <w:u w:val="none"/>
         </w:rPr>
-        <w:t xml:space="preserve">Backend e dados: </w:t>
+        <w:t xml:space="preserve">Backend: </w:t>
       </w:r>
       <w:r>
         <w:rPr>
           <w:rFonts w:ascii="Arial" w:hAnsi="Arial"/>
-          <w:color w:val="1C1F24"/>
+          <w:b w:val="0"/>
+          <w:i w:val="0"/>
+          <w:color w:val="000000"/>
           <w:sz w:val="18"/>
+          <w:u w:val="none"/>
         </w:rPr>
-        <w:t>Node.js/Express, Python/FastAPI, Go, APIs REST, PostgreSQL, Prisma, GORM, Redis e BullMQ</w:t>
+        <w:t>Node.js/Express, Python/FastAPI, Go, APIs REST versionadas, DTOs, Zod, autenticação e webhooks.</w:t>
       </w:r>
     </w:p>
     <w:p>
       <w:pPr>
-        <w:spacing w:after="42" w:line="245" w:lineRule="auto"/>
-        <w:ind w:left="29" w:firstLine="0"/>
+        <w:spacing w:after="36" w:line="240" w:lineRule="auto"/>
         <w:keepLines/>
       </w:pPr>
       <w:r>
         <w:rPr>
           <w:rFonts w:ascii="Arial" w:hAnsi="Arial"/>
           <w:b/>
-          <w:color w:val="B17A0F"/>
+          <w:i w:val="0"/>
+          <w:color w:val="000000"/>
           <w:sz w:val="18"/>
+          <w:u w:val="none"/>
         </w:rPr>
-        <w:t xml:space="preserve">Cloud e operação: </w:t>
+        <w:t xml:space="preserve">Dados e assíncrono: </w:t>
       </w:r>
       <w:r>
         <w:rPr>
           <w:rFonts w:ascii="Arial" w:hAnsi="Arial"/>
-          <w:color w:val="1C1F24"/>
+          <w:b w:val="0"/>
+          <w:i w:val="0"/>
+          <w:color w:val="000000"/>
           <w:sz w:val="18"/>
+          <w:u w:val="none"/>
         </w:rPr>
-        <w:t>Docker, Nginx, AWS EC2, Railway, Vercel, PM2, Tailscale, CI/CD, logs e rollback</w:t>
+        <w:t>PostgreSQL 16/17, Prisma, GORM, Redis, BullMQ, modelagem multi-tenant, migrations, idempotência e retry/backoff.</w:t>
       </w:r>
     </w:p>
     <w:p>
       <w:pPr>
-        <w:spacing w:after="42" w:line="245" w:lineRule="auto"/>
-        <w:ind w:left="29" w:firstLine="0"/>
+        <w:spacing w:after="36" w:line="240" w:lineRule="auto"/>
         <w:keepLines/>
       </w:pPr>
       <w:r>
         <w:rPr>
           <w:rFonts w:ascii="Arial" w:hAnsi="Arial"/>
           <w:b/>
-          <w:color w:val="B17A0F"/>
+          <w:i w:val="0"/>
+          <w:color w:val="000000"/>
           <w:sz w:val="18"/>
+          <w:u w:val="none"/>
         </w:rPr>
-        <w:t xml:space="preserve">Integrações e IA: </w:t>
+        <w:t xml:space="preserve">Infraestrutura: </w:t>
       </w:r>
       <w:r>
         <w:rPr>
           <w:rFonts w:ascii="Arial" w:hAnsi="Arial"/>
-          <w:color w:val="1C1F24"/>
+          <w:b w:val="0"/>
+          <w:i w:val="0"/>
+          <w:color w:val="000000"/>
           <w:sz w:val="18"/>
+          <w:u w:val="none"/>
         </w:rPr>
-        <w:t>Shopee, Mercado Livre, TikTok Shop, Amazon SP-API, WhatsApp Cloud API, Bitrix24, n8n, OpenAI e Claude</w:t>
+        <w:t>Docker, Docker Compose, Nginx, AWS EC2, Railway, Vercel, PM2, Tailscale, Linux e deploy com rollback.</w:t>
+      </w:r>
+    </w:p>
+    <w:p>
+      <w:pPr>
+        <w:spacing w:after="36" w:line="240" w:lineRule="auto"/>
+        <w:keepLines/>
+      </w:pPr>
+      <w:r>
+        <w:rPr>
+          <w:rFonts w:ascii="Arial" w:hAnsi="Arial"/>
+          <w:b/>
+          <w:i w:val="0"/>
+          <w:color w:val="000000"/>
+          <w:sz w:val="18"/>
+          <w:u w:val="none"/>
+        </w:rPr>
+        <w:t xml:space="preserve">IA e automação: </w:t>
+      </w:r>
+      <w:r>
+        <w:rPr>
+          <w:rFonts w:ascii="Arial" w:hAnsi="Arial"/>
+          <w:b w:val="0"/>
+          <w:i w:val="0"/>
+          <w:color w:val="000000"/>
+          <w:sz w:val="18"/>
+          <w:u w:val="none"/>
+        </w:rPr>
+        <w:t>OpenAI, Claude, visão computacional, geração de texto/imagem, n8n, classificação de conversas e agentes de código.</w:t>
       </w:r>
     </w:p>
     <w:p>
       <w:pPr>
         <w:pStyle w:val="Heading1"/>
+        <w:spacing w:before="120" w:after="60"/>
+        <w:pBdr>
+          <w:bottom w:val="single" w:sz="6" w:space="4" w:color="000000"/>
+        </w:pBdr>
+        <w:keepLines/>
         <w:keepNext/>
-        <w:pBdr>
-          <w:bottom w:val="single" w:sz="8" w:space="4" w:color="C68A18"/>
-        </w:pBdr>
       </w:pPr>
       <w:r>
         <w:t>EXPERIÊNCIA PROFISSIONAL</w:t>
@@ -199,174 +459,243 @@
     <w:p>
       <w:pPr>
         <w:spacing w:before="60" w:after="40"/>
+        <w:keepLines/>
         <w:keepNext/>
       </w:pPr>
       <w:r>
         <w:rPr>
           <w:rFonts w:ascii="Arial" w:hAnsi="Arial"/>
           <w:b/>
-          <w:color w:val="1C1F24"/>
+          <w:i w:val="0"/>
+          <w:color w:val="000000"/>
           <w:sz w:val="20"/>
+          <w:u w:val="none"/>
         </w:rPr>
-        <w:t>Desenvolvedor Full Stack</w:t>
+        <w:t>Desenvolvedor Full Stack / Responsável Técnico</w:t>
       </w:r>
       <w:r>
         <w:rPr>
           <w:rFonts w:ascii="Arial" w:hAnsi="Arial"/>
           <w:b w:val="0"/>
-          <w:color w:val="555B63"/>
+          <w:i w:val="0"/>
+          <w:color w:val="000000"/>
           <w:sz w:val="20"/>
+          <w:u w:val="none"/>
         </w:rPr>
-        <w:t xml:space="preserve">  |  Value Agência</w:t>
+        <w:t xml:space="preserve"> | Value Agência</w:t>
       </w:r>
       <w:r>
         <w:rPr>
           <w:rFonts w:ascii="Arial" w:hAnsi="Arial"/>
           <w:b w:val="0"/>
           <w:i/>
-          <w:color w:val="555B63"/>
+          <w:color w:val="2D2D2D"/>
           <w:sz w:val="18"/>
+          <w:u w:val="none"/>
         </w:rPr>
-        <w:t xml:space="preserve">  |  2025–2026</w:t>
+        <w:t xml:space="preserve"> | 2025–2026</w:t>
       </w:r>
     </w:p>
     <w:p>
       <w:pPr>
         <w:pStyle w:val="ListBullet"/>
-        <w:spacing w:after="44" w:line="245" w:lineRule="auto"/>
+        <w:spacing w:after="34" w:line="240" w:lineRule="auto"/>
         <w:keepLines/>
       </w:pPr>
       <w:r>
         <w:rPr>
           <w:rFonts w:ascii="Arial" w:hAnsi="Arial"/>
-          <w:color w:val="1C1F24"/>
+          <w:b w:val="0"/>
+          <w:i w:val="0"/>
+          <w:color w:val="000000"/>
           <w:sz w:val="18"/>
+          <w:u w:val="none"/>
         </w:rPr>
-        <w:t>Atuei como responsável técnico por quatro produtos em produção — financeiro, analytics, IA e intranet — da modelagem de dados ao deploy e à sustentação.</w:t>
+        <w:t>Responsável pela arquitetura, desenvolvimento, deploy e sustentação de quatro produtos: Value Finanças, Value Analytics, Value AI Studio e plataforma interna.</w:t>
       </w:r>
     </w:p>
     <w:p>
       <w:pPr>
         <w:pStyle w:val="ListBullet"/>
-        <w:spacing w:after="44" w:line="245" w:lineRule="auto"/>
+        <w:spacing w:after="34" w:line="240" w:lineRule="auto"/>
         <w:keepLines/>
       </w:pPr>
       <w:r>
         <w:rPr>
           <w:rFonts w:ascii="Arial" w:hAnsi="Arial"/>
-          <w:color w:val="1C1F24"/>
+          <w:b w:val="0"/>
+          <w:i w:val="0"/>
+          <w:color w:val="000000"/>
           <w:sz w:val="18"/>
+          <w:u w:val="none"/>
         </w:rPr>
-        <w:t>Projetei uma plataforma financeira multi-tenant em Go, PostgreSQL e Next.js, cobrindo assinaturas, faturamento recorrente, crédito de clientes, conciliação bancária e cálculo de MRR.</w:t>
+        <w:t>Projetei a plataforma financeira multi-tenant em Go, PostgreSQL e Next.js, com assinaturas, faturamento recorrente, conciliação bancária, crédito de clientes, cancelamentos e cálculo de MRR.</w:t>
       </w:r>
     </w:p>
     <w:p>
       <w:pPr>
         <w:pStyle w:val="ListBullet"/>
-        <w:spacing w:after="44" w:line="245" w:lineRule="auto"/>
+        <w:spacing w:after="34" w:line="240" w:lineRule="auto"/>
         <w:keepLines/>
       </w:pPr>
       <w:r>
         <w:rPr>
           <w:rFonts w:ascii="Arial" w:hAnsi="Arial"/>
-          <w:color w:val="1C1F24"/>
+          <w:b w:val="0"/>
+          <w:i w:val="0"/>
+          <w:color w:val="000000"/>
           <w:sz w:val="18"/>
+          <w:u w:val="none"/>
         </w:rPr>
-        <w:t>Implementei integrações com Shopee Open Platform, Mercado Livre, TikTok Shop e Amazon SP-API, incluindo OAuth, assinatura de requisições e normalização de pedidos.</w:t>
+        <w:t>Implementei integrações oficiais com Shopee, Mercado Livre, TikTok Shop e Amazon, cobrindo OAuth, assinatura de requisições, webhooks, normalização de pedidos e tratamento de fuso horário.</w:t>
       </w:r>
     </w:p>
     <w:p>
       <w:pPr>
         <w:pStyle w:val="ListBullet"/>
-        <w:spacing w:after="44" w:line="245" w:lineRule="auto"/>
+        <w:spacing w:after="34" w:line="240" w:lineRule="auto"/>
         <w:keepLines/>
       </w:pPr>
       <w:r>
         <w:rPr>
           <w:rFonts w:ascii="Arial" w:hAnsi="Arial"/>
-          <w:color w:val="1C1F24"/>
+          <w:b w:val="0"/>
+          <w:i w:val="0"/>
+          <w:color w:val="000000"/>
           <w:sz w:val="18"/>
+          <w:u w:val="none"/>
         </w:rPr>
-        <w:t>Entreguei um produto de geração de anúncios com IA utilizado por mais de 400 usuários pagantes, com análise de imagens, geração de textos e criativos e controle de créditos.</w:t>
+        <w:t>Entreguei o Value AI Studio, usado por mais de 400 usuários pagantes, com análise de imagem, extração de atributos, geração de títulos, descrições, criativos e controle de créditos.</w:t>
       </w:r>
     </w:p>
     <w:p>
       <w:pPr>
         <w:pStyle w:val="ListBullet"/>
-        <w:spacing w:after="44" w:line="245" w:lineRule="auto"/>
+        <w:spacing w:after="34" w:line="240" w:lineRule="auto"/>
         <w:keepLines/>
       </w:pPr>
       <w:r>
         <w:rPr>
           <w:rFonts w:ascii="Arial" w:hAnsi="Arial"/>
-          <w:color w:val="1C1F24"/>
+          <w:b w:val="0"/>
+          <w:i w:val="0"/>
+          <w:color w:val="000000"/>
           <w:sz w:val="18"/>
+          <w:u w:val="none"/>
         </w:rPr>
-        <w:t>Automatizei rotinas comerciais e de Customer Success no Bitrix24 e n8n; também participei da operação de monitoramento inteligente de 514 grupos de WhatsApp.</w:t>
+        <w:t>Automatizei processos comerciais e de CS no Bitrix24 e n8n, com deduplicação de leads, filas BullMQ, health score, acompanhamento de clientes e painéis de churn e retenção.</w:t>
       </w:r>
     </w:p>
     <w:p>
       <w:pPr>
         <w:pStyle w:val="ListBullet"/>
-        <w:spacing w:after="44" w:line="245" w:lineRule="auto"/>
+        <w:spacing w:after="34" w:line="240" w:lineRule="auto"/>
         <w:keepLines/>
       </w:pPr>
       <w:r>
         <w:rPr>
           <w:rFonts w:ascii="Arial" w:hAnsi="Arial"/>
-          <w:color w:val="1C1F24"/>
+          <w:b w:val="0"/>
+          <w:i w:val="0"/>
+          <w:color w:val="000000"/>
           <w:sz w:val="18"/>
+          <w:u w:val="none"/>
         </w:rPr>
-        <w:t>Conduzi a resposta a um incidente de criação fraudulenta de contas, implantando bloqueio por IP, rate limiting, verificação de e-mail e controles de liberação de créditos.</w:t>
+        <w:t>Integrei notificações e rotinas via WhatsApp Cloud API, com templates homologados, webhooks assinados e processamento idempotente em background.</w:t>
+      </w:r>
+    </w:p>
+    <w:p>
+      <w:pPr>
+        <w:pStyle w:val="ListBullet"/>
+        <w:spacing w:after="34" w:line="240" w:lineRule="auto"/>
+        <w:keepLines/>
+      </w:pPr>
+      <w:r>
+        <w:rPr>
+          <w:rFonts w:ascii="Arial" w:hAnsi="Arial"/>
+          <w:b w:val="0"/>
+          <w:i w:val="0"/>
+          <w:color w:val="000000"/>
+          <w:sz w:val="18"/>
+          <w:u w:val="none"/>
+        </w:rPr>
+        <w:t>Conduzi resposta a incidente de contas fraudulentas com bloqueio por IP, rate limiting, verificação de e-mail e proteção da liberação de créditos.</w:t>
       </w:r>
     </w:p>
     <w:p>
       <w:pPr>
         <w:spacing w:before="60" w:after="40"/>
+        <w:keepLines/>
         <w:keepNext/>
       </w:pPr>
       <w:r>
         <w:rPr>
           <w:rFonts w:ascii="Arial" w:hAnsi="Arial"/>
           <w:b/>
-          <w:color w:val="1C1F24"/>
+          <w:i w:val="0"/>
+          <w:color w:val="000000"/>
           <w:sz w:val="20"/>
+          <w:u w:val="none"/>
         </w:rPr>
-        <w:t>Suporte de TI / Suporte a Sistemas</w:t>
+        <w:t>Técnico de Informática / Suporte de TI</w:t>
       </w:r>
       <w:r>
         <w:rPr>
           <w:rFonts w:ascii="Arial" w:hAnsi="Arial"/>
           <w:b w:val="0"/>
-          <w:color w:val="555B63"/>
+          <w:i w:val="0"/>
+          <w:color w:val="000000"/>
           <w:sz w:val="20"/>
+          <w:u w:val="none"/>
         </w:rPr>
-        <w:t xml:space="preserve">  |  Atendimento corporativo</w:t>
+        <w:t xml:space="preserve"> | Sestape Store</w:t>
       </w:r>
       <w:r>
         <w:rPr>
           <w:rFonts w:ascii="Arial" w:hAnsi="Arial"/>
           <w:b w:val="0"/>
           <w:i/>
-          <w:color w:val="555B63"/>
+          <w:color w:val="2D2D2D"/>
           <w:sz w:val="18"/>
+          <w:u w:val="none"/>
         </w:rPr>
-        <w:t xml:space="preserve">  |  Experiência anterior</w:t>
+        <w:t xml:space="preserve"> | Experiência anterior</w:t>
       </w:r>
     </w:p>
     <w:p>
       <w:pPr>
         <w:pStyle w:val="ListBullet"/>
-        <w:spacing w:after="44" w:line="245" w:lineRule="auto"/>
+        <w:spacing w:after="34" w:line="240" w:lineRule="auto"/>
         <w:keepLines/>
       </w:pPr>
       <w:r>
         <w:rPr>
           <w:rFonts w:ascii="Arial" w:hAnsi="Arial"/>
-          <w:color w:val="1C1F24"/>
+          <w:b w:val="0"/>
+          <w:i w:val="0"/>
+          <w:color w:val="000000"/>
           <w:sz w:val="18"/>
+          <w:u w:val="none"/>
         </w:rPr>
-        <w:t>Diagnóstico de incidentes em sistemas, redes e dispositivos, documentação de atendimentos e automação de rotinas repetitivas por scripts.</w:t>
+        <w:t>Montagem e manutenção de computadores, diagnóstico de falhas, suporte a usuários e atendimento técnico em sistemas e dispositivos.</w:t>
+      </w:r>
+    </w:p>
+    <w:p>
+      <w:pPr>
+        <w:pStyle w:val="ListBullet"/>
+        <w:spacing w:after="34" w:line="240" w:lineRule="auto"/>
+        <w:keepLines/>
+      </w:pPr>
+      <w:r>
+        <w:rPr>
+          <w:rFonts w:ascii="Arial" w:hAnsi="Arial"/>
+          <w:b w:val="0"/>
+          <w:i w:val="0"/>
+          <w:color w:val="000000"/>
+          <w:sz w:val="18"/>
+          <w:u w:val="none"/>
+        </w:rPr>
+        <w:t>Apoio às rotinas de tecnologia e à operação de e-commerce/Shopee, incluindo registros de atendimento e organização de demandas técnicas.</w:t>
       </w:r>
     </w:p>
     <w:p>
@@ -377,274 +706,419 @@
     <w:p>
       <w:pPr>
         <w:pStyle w:val="Heading1"/>
+        <w:spacing w:before="120" w:after="60"/>
+        <w:pBdr>
+          <w:bottom w:val="single" w:sz="6" w:space="4" w:color="000000"/>
+        </w:pBdr>
+        <w:keepLines/>
         <w:keepNext/>
-        <w:pBdr>
-          <w:bottom w:val="single" w:sz="8" w:space="4" w:color="C68A18"/>
-        </w:pBdr>
       </w:pPr>
       <w:r>
-        <w:t>PROJETOS SELECIONADOS</w:t>
+        <w:t>PROJETOS TÉCNICOS SELECIONADOS</w:t>
       </w:r>
     </w:p>
     <w:p>
       <w:pPr>
-        <w:spacing w:before="40" w:after="20"/>
+        <w:spacing w:before="54" w:after="20"/>
+        <w:keepLines/>
         <w:keepNext/>
       </w:pPr>
       <w:r>
         <w:rPr>
           <w:rFonts w:ascii="Arial" w:hAnsi="Arial"/>
           <w:b/>
-          <w:color w:val="1C1F24"/>
+          <w:i w:val="0"/>
+          <w:color w:val="000000"/>
           <w:sz w:val="19"/>
+          <w:u w:val="none"/>
         </w:rPr>
-        <w:t>Value Finanças</w:t>
+        <w:t>Value Finanças — plataforma financeira e billing multi-tenant</w:t>
       </w:r>
       <w:r>
         <w:rPr>
           <w:rFonts w:ascii="Arial" w:hAnsi="Arial"/>
           <w:b w:val="0"/>
-          <w:color w:val="B17A0F"/>
+          <w:i w:val="0"/>
+          <w:color w:val="2D2D2D"/>
           <w:sz w:val="17"/>
+          <w:u w:val="none"/>
         </w:rPr>
-        <w:t xml:space="preserve">  ·  Go · PostgreSQL · GORM · Next.js · Docker · AWS EC2</w:t>
+        <w:t xml:space="preserve"> | Go | PostgreSQL 17 | GORM | Next.js 14 | Docker | AWS EC2</w:t>
       </w:r>
     </w:p>
     <w:p>
       <w:pPr>
-        <w:spacing w:after="50" w:line="245" w:lineRule="auto"/>
-        <w:ind w:left="202"/>
+        <w:pStyle w:val="ListBullet"/>
+        <w:spacing w:after="34" w:line="240" w:lineRule="auto"/>
         <w:keepLines/>
       </w:pPr>
       <w:r>
         <w:rPr>
           <w:rFonts w:ascii="Arial" w:hAnsi="Arial"/>
-          <w:color w:val="1C1F24"/>
+          <w:b w:val="0"/>
+          <w:i w:val="0"/>
+          <w:color w:val="000000"/>
           <w:sz w:val="18"/>
+          <w:u w:val="none"/>
         </w:rPr>
-        <w:t>Plataforma financeira e de billing multi-tenant com assinaturas, faturas automáticas e manuais, crédito de clientes, cancelamentos, conciliação e comunicação segura entre serviços.</w:t>
+        <w:t>Assinaturas recorrentes, faturas automáticas e manuais, crédito por cliente, gestão de cancelamentos, conciliação e transferências entre contas.</w:t>
       </w:r>
     </w:p>
     <w:p>
       <w:pPr>
-        <w:spacing w:before="40" w:after="20"/>
+        <w:pStyle w:val="ListBullet"/>
+        <w:spacing w:after="34" w:line="240" w:lineRule="auto"/>
+        <w:keepLines/>
+      </w:pPr>
+      <w:r>
+        <w:rPr>
+          <w:rFonts w:ascii="Arial" w:hAnsi="Arial"/>
+          <w:b w:val="0"/>
+          <w:i w:val="0"/>
+          <w:color w:val="000000"/>
+          <w:sz w:val="18"/>
+          <w:u w:val="none"/>
+        </w:rPr>
+        <w:t>Comunicação service-to-service autenticada com o Analytics, migrations versionadas, trilha de auditoria e procedimento de rollback para rotas críticas.</w:t>
+      </w:r>
+    </w:p>
+    <w:p>
+      <w:pPr>
+        <w:spacing w:before="54" w:after="20"/>
+        <w:keepLines/>
         <w:keepNext/>
       </w:pPr>
       <w:r>
         <w:rPr>
           <w:rFonts w:ascii="Arial" w:hAnsi="Arial"/>
           <w:b/>
-          <w:color w:val="1C1F24"/>
+          <w:i w:val="0"/>
+          <w:color w:val="000000"/>
           <w:sz w:val="19"/>
+          <w:u w:val="none"/>
         </w:rPr>
-        <w:t>Value Analytics</w:t>
+        <w:t>Value Analytics — BI multi-marketplace</w:t>
       </w:r>
       <w:r>
         <w:rPr>
           <w:rFonts w:ascii="Arial" w:hAnsi="Arial"/>
           <w:b w:val="0"/>
-          <w:color w:val="B17A0F"/>
+          <w:i w:val="0"/>
+          <w:color w:val="2D2D2D"/>
           <w:sz w:val="17"/>
+          <w:u w:val="none"/>
         </w:rPr>
-        <w:t xml:space="preserve">  ·  Python/FastAPI · Next.js · PostgreSQL · Redis · Railway</w:t>
+        <w:t xml:space="preserve"> | Python/FastAPI | Next.js | PostgreSQL | Redis | Railway</w:t>
       </w:r>
     </w:p>
     <w:p>
       <w:pPr>
-        <w:spacing w:after="50" w:line="245" w:lineRule="auto"/>
-        <w:ind w:left="202"/>
+        <w:pStyle w:val="ListBullet"/>
+        <w:spacing w:after="34" w:line="240" w:lineRule="auto"/>
         <w:keepLines/>
       </w:pPr>
       <w:r>
         <w:rPr>
           <w:rFonts w:ascii="Arial" w:hAnsi="Arial"/>
-          <w:color w:val="1C1F24"/>
+          <w:b w:val="0"/>
+          <w:i w:val="0"/>
+          <w:color w:val="000000"/>
           <w:sz w:val="18"/>
+          <w:u w:val="none"/>
         </w:rPr>
-        <w:t>BI que consolida pedidos, vendas, comissões e fulfillment de Shopee, Mercado Livre, TikTok Shop e Amazon, com provisionamento automático de lojas e suporte por impersonação segura.</w:t>
+        <w:t>Consolidação de vendas, pedidos, comissões e fulfillment de Shopee, Mercado Livre, TikTok Shop e Amazon em um painel por loja.</w:t>
       </w:r>
     </w:p>
     <w:p>
       <w:pPr>
-        <w:spacing w:before="40" w:after="20"/>
+        <w:pStyle w:val="ListBullet"/>
+        <w:spacing w:after="34" w:line="240" w:lineRule="auto"/>
+        <w:keepLines/>
+      </w:pPr>
+      <w:r>
+        <w:rPr>
+          <w:rFonts w:ascii="Arial" w:hAnsi="Arial"/>
+          <w:b w:val="0"/>
+          <w:i w:val="0"/>
+          <w:color w:val="000000"/>
+          <w:sz w:val="18"/>
+          <w:u w:val="none"/>
+        </w:rPr>
+        <w:t>OAuth, assinatura de requisições, provisionamento automático de lojas e impersonação segura de suporte com ticket de uso único no Redis.</w:t>
+      </w:r>
+    </w:p>
+    <w:p>
+      <w:pPr>
+        <w:spacing w:before="54" w:after="20"/>
+        <w:keepLines/>
         <w:keepNext/>
       </w:pPr>
       <w:r>
         <w:rPr>
           <w:rFonts w:ascii="Arial" w:hAnsi="Arial"/>
           <w:b/>
-          <w:color w:val="1C1F24"/>
+          <w:i w:val="0"/>
+          <w:color w:val="000000"/>
           <w:sz w:val="19"/>
+          <w:u w:val="none"/>
         </w:rPr>
-        <w:t>Value AI Studio</w:t>
+        <w:t>Value AI Studio — geração de anúncios com IA</w:t>
       </w:r>
       <w:r>
         <w:rPr>
           <w:rFonts w:ascii="Arial" w:hAnsi="Arial"/>
           <w:b w:val="0"/>
-          <w:color w:val="B17A0F"/>
+          <w:i w:val="0"/>
+          <w:color w:val="2D2D2D"/>
           <w:sz w:val="17"/>
+          <w:u w:val="none"/>
         </w:rPr>
-        <w:t xml:space="preserve">  ·  Next.js · Express/TypeScript · FastAPI · OpenAI · Claude · fal.ai</w:t>
+        <w:t xml:space="preserve"> | Next.js | Express/TypeScript | FastAPI | OpenAI | Claude | fal.ai | Eduzz</w:t>
       </w:r>
     </w:p>
     <w:p>
       <w:pPr>
-        <w:spacing w:after="50" w:line="245" w:lineRule="auto"/>
-        <w:ind w:left="202"/>
+        <w:pStyle w:val="ListBullet"/>
+        <w:spacing w:after="34" w:line="240" w:lineRule="auto"/>
         <w:keepLines/>
       </w:pPr>
       <w:r>
         <w:rPr>
           <w:rFonts w:ascii="Arial" w:hAnsi="Arial"/>
-          <w:color w:val="1C1F24"/>
+          <w:b w:val="0"/>
+          <w:i w:val="0"/>
+          <w:color w:val="000000"/>
           <w:sz w:val="18"/>
+          <w:u w:val="none"/>
         </w:rPr>
-        <w:t>Pipeline de geração de anúncios: upload, visão computacional, extração de atributos, criação de título e descrição e produção de criativos, com edição por chat e gestão de créditos.</w:t>
+        <w:t>Pipeline completo: upload da imagem, visão computacional, extração de atributos, palavras-chave, título, descrição e criativos publicáveis.</w:t>
       </w:r>
     </w:p>
     <w:p>
       <w:pPr>
-        <w:spacing w:before="40" w:after="20"/>
+        <w:pStyle w:val="ListBullet"/>
+        <w:spacing w:after="34" w:line="240" w:lineRule="auto"/>
+        <w:keepLines/>
+      </w:pPr>
+      <w:r>
+        <w:rPr>
+          <w:rFonts w:ascii="Arial" w:hAnsi="Arial"/>
+          <w:b w:val="0"/>
+          <w:i w:val="0"/>
+          <w:color w:val="000000"/>
+          <w:sz w:val="18"/>
+          <w:u w:val="none"/>
+        </w:rPr>
+        <w:t>Sistema de créditos integrado ao checkout, edição encadeada por chat, variações de cena e orquestração de jobs de geração de imagem.</w:t>
+      </w:r>
+    </w:p>
+    <w:p>
+      <w:pPr>
+        <w:spacing w:before="54" w:after="20"/>
+        <w:keepLines/>
         <w:keepNext/>
       </w:pPr>
       <w:r>
         <w:rPr>
           <w:rFonts w:ascii="Arial" w:hAnsi="Arial"/>
           <w:b/>
-          <w:color w:val="1C1F24"/>
+          <w:i w:val="0"/>
+          <w:color w:val="000000"/>
           <w:sz w:val="19"/>
+          <w:u w:val="none"/>
         </w:rPr>
-        <w:t>CRM e Automação Comercial/CS</w:t>
+        <w:t>Plataforma interna e automações de operação</w:t>
       </w:r>
       <w:r>
         <w:rPr>
           <w:rFonts w:ascii="Arial" w:hAnsi="Arial"/>
           <w:b w:val="0"/>
-          <w:color w:val="B17A0F"/>
+          <w:i w:val="0"/>
+          <w:color w:val="2D2D2D"/>
           <w:sz w:val="17"/>
+          <w:u w:val="none"/>
         </w:rPr>
-        <w:t xml:space="preserve">  ·  Bitrix24 · n8n · BullMQ · Redis · WhatsApp Cloud API</w:t>
+        <w:t xml:space="preserve"> | Turborepo | pnpm | NextAuth v5 | PostgreSQL | Redis | Nginx | n8n | Tailscale</w:t>
       </w:r>
     </w:p>
     <w:p>
       <w:pPr>
-        <w:spacing w:after="50" w:line="245" w:lineRule="auto"/>
-        <w:ind w:left="202"/>
+        <w:pStyle w:val="ListBullet"/>
+        <w:spacing w:after="34" w:line="240" w:lineRule="auto"/>
         <w:keepLines/>
       </w:pPr>
       <w:r>
         <w:rPr>
           <w:rFonts w:ascii="Arial" w:hAnsi="Arial"/>
-          <w:color w:val="1C1F24"/>
+          <w:b w:val="0"/>
+          <w:i w:val="0"/>
+          <w:color w:val="000000"/>
           <w:sz w:val="18"/>
+          <w:u w:val="none"/>
         </w:rPr>
-        <w:t>Funil automatizado com deduplicação de leads, jobs idempotentes, health score, acompanhamento de clientes e painéis de churn, retenção e risco de cancelamento.</w:t>
+        <w:t>Monorepo interno com autenticação Argon2id/NextAuth, serviços orquestrados em Docker Compose e acesso privado por Tailscale com HTTPS.</w:t>
       </w:r>
     </w:p>
     <w:p>
       <w:pPr>
-        <w:spacing w:before="40" w:after="20"/>
+        <w:pStyle w:val="ListBullet"/>
+        <w:spacing w:after="34" w:line="240" w:lineRule="auto"/>
+        <w:keepLines/>
+      </w:pPr>
+      <w:r>
+        <w:rPr>
+          <w:rFonts w:ascii="Arial" w:hAnsi="Arial"/>
+          <w:b w:val="0"/>
+          <w:i w:val="0"/>
+          <w:color w:val="000000"/>
+          <w:sz w:val="18"/>
+          <w:u w:val="none"/>
+        </w:rPr>
+        <w:t>CRM e Customer Success integrados ao Bitrix24, monitoramento de grupos, classificação automática de conversas e dashboards operacionais.</w:t>
+      </w:r>
+    </w:p>
+    <w:p>
+      <w:pPr>
+        <w:spacing w:before="54" w:after="20"/>
+        <w:keepLines/>
         <w:keepNext/>
       </w:pPr>
       <w:r>
         <w:rPr>
           <w:rFonts w:ascii="Arial" w:hAnsi="Arial"/>
           <w:b/>
-          <w:color w:val="1C1F24"/>
+          <w:i w:val="0"/>
+          <w:color w:val="000000"/>
           <w:sz w:val="19"/>
+          <w:u w:val="none"/>
         </w:rPr>
-        <w:t>XY Works</w:t>
+        <w:t>XY Works — produtos próprios e automação</w:t>
       </w:r>
       <w:r>
         <w:rPr>
           <w:rFonts w:ascii="Arial" w:hAnsi="Arial"/>
           <w:b w:val="0"/>
-          <w:color w:val="B17A0F"/>
+          <w:i w:val="0"/>
+          <w:color w:val="2D2D2D"/>
           <w:sz w:val="17"/>
+          <w:u w:val="none"/>
         </w:rPr>
-        <w:t xml:space="preserve">  ·  HTML/CSS/JS · Vercel · n8n</w:t>
+        <w:t xml:space="preserve"> | Next.js | Node.js | TypeScript | HTML/CSS/JS | Vercel | n8n</w:t>
       </w:r>
     </w:p>
     <w:p>
       <w:pPr>
-        <w:spacing w:after="50" w:line="245" w:lineRule="auto"/>
-        <w:ind w:left="202"/>
+        <w:pStyle w:val="ListBullet"/>
+        <w:spacing w:after="34" w:line="240" w:lineRule="auto"/>
         <w:keepLines/>
       </w:pPr>
       <w:r>
         <w:rPr>
           <w:rFonts w:ascii="Arial" w:hAnsi="Arial"/>
-          <w:color w:val="1C1F24"/>
+          <w:b w:val="0"/>
+          <w:i w:val="0"/>
+          <w:color w:val="000000"/>
           <w:sz w:val="18"/>
+          <w:u w:val="none"/>
         </w:rPr>
-        <w:t>Projeto autoral com ferramentas web para marketplaces, incluindo calculadora de precificação e gerador de conteúdo para redes sociais.</w:t>
+        <w:t>Marca autoral voltada a automação, CRM personalizado, integrações, dashboards e produtos digitais para empresas.</w:t>
+      </w:r>
+    </w:p>
+    <w:p>
+      <w:pPr>
+        <w:pStyle w:val="ListBullet"/>
+        <w:spacing w:after="34" w:line="240" w:lineRule="auto"/>
+        <w:keepLines/>
+      </w:pPr>
+      <w:r>
+        <w:rPr>
+          <w:rFonts w:ascii="Arial" w:hAnsi="Arial"/>
+          <w:b w:val="0"/>
+          <w:i w:val="0"/>
+          <w:color w:val="000000"/>
+          <w:sz w:val="18"/>
+          <w:u w:val="none"/>
+        </w:rPr>
+        <w:t>Ferramentas publicadas para marketplaces, incluindo calculadora de precificação e gerador de conteúdo para redes sociais.</w:t>
       </w:r>
     </w:p>
     <w:p>
       <w:pPr>
         <w:pStyle w:val="Heading1"/>
+        <w:spacing w:before="120" w:after="60"/>
+        <w:pBdr>
+          <w:bottom w:val="single" w:sz="6" w:space="4" w:color="000000"/>
+        </w:pBdr>
+        <w:keepLines/>
         <w:keepNext/>
-        <w:pBdr>
-          <w:bottom w:val="single" w:sz="8" w:space="4" w:color="C68A18"/>
-        </w:pBdr>
       </w:pPr>
       <w:r>
-        <w:t>COMO EU TRABALHO</w:t>
+        <w:t>PRÁTICAS DE ENGENHARIA</w:t>
       </w:r>
     </w:p>
     <w:p>
       <w:pPr>
         <w:pStyle w:val="ListBullet"/>
-        <w:spacing w:after="44" w:line="245" w:lineRule="auto"/>
+        <w:spacing w:after="34" w:line="240" w:lineRule="auto"/>
         <w:keepLines/>
       </w:pPr>
       <w:r>
         <w:rPr>
           <w:rFonts w:ascii="Arial" w:hAnsi="Arial"/>
-          <w:color w:val="1C1F24"/>
+          <w:b w:val="0"/>
+          <w:i w:val="0"/>
+          <w:color w:val="000000"/>
           <w:sz w:val="18"/>
+          <w:u w:val="none"/>
         </w:rPr>
-        <w:t>Assumo o ciclo completo: entendimento do problema, arquitetura, banco de dados, backend, frontend, infraestrutura, deploy e acompanhamento em produção.</w:t>
+        <w:t>TypeScript strict, validação server-side, migrations versionadas, revisão de código, logs estruturados e rollback documentado.</w:t>
       </w:r>
     </w:p>
     <w:p>
       <w:pPr>
         <w:pStyle w:val="ListBullet"/>
-        <w:spacing w:after="44" w:line="245" w:lineRule="auto"/>
+        <w:spacing w:after="34" w:line="240" w:lineRule="auto"/>
         <w:keepLines/>
       </w:pPr>
       <w:r>
         <w:rPr>
           <w:rFonts w:ascii="Arial" w:hAnsi="Arial"/>
-          <w:color w:val="1C1F24"/>
+          <w:b w:val="0"/>
+          <w:i w:val="0"/>
+          <w:color w:val="000000"/>
           <w:sz w:val="18"/>
+          <w:u w:val="none"/>
         </w:rPr>
-        <w:t>Tenho experiência com integrações que exigem OAuth, homologação, webhooks, assinatura criptográfica, idempotência e tratamento de falhas.</w:t>
+        <w:t>Jobs idempotentes com Redis/BullMQ, deduplicação, retry/backoff, locks distribuídos e desacoplamento do processamento em background.</w:t>
       </w:r>
     </w:p>
     <w:p>
       <w:pPr>
         <w:pStyle w:val="ListBullet"/>
-        <w:spacing w:after="44" w:line="245" w:lineRule="auto"/>
+        <w:spacing w:after="34" w:line="240" w:lineRule="auto"/>
         <w:keepLines/>
       </w:pPr>
       <w:r>
         <w:rPr>
           <w:rFonts w:ascii="Arial" w:hAnsi="Arial"/>
-          <w:color w:val="1C1F24"/>
+          <w:b w:val="0"/>
+          <w:i w:val="0"/>
+          <w:color w:val="000000"/>
           <w:sz w:val="18"/>
+          <w:u w:val="none"/>
         </w:rPr>
-        <w:t>Uso IA como acelerador de engenharia e produto, mantendo revisão humana, validação técnica e responsabilidade sobre o resultado final.</w:t>
+        <w:t>Autenticação por JWT em cookies httpOnly, Argon2id, OAuth 2.0, rate limiting, CSRF e resposta a incidentes de abuso.</w:t>
       </w:r>
     </w:p>
     <w:p>
       <w:pPr>
         <w:pStyle w:val="Heading1"/>
+        <w:spacing w:before="120" w:after="60"/>
+        <w:pBdr>
+          <w:bottom w:val="single" w:sz="6" w:space="4" w:color="000000"/>
+        </w:pBdr>
+        <w:keepLines/>
         <w:keepNext/>
-        <w:pBdr>
-          <w:bottom w:val="single" w:sz="8" w:space="4" w:color="C68A18"/>
-        </w:pBdr>
       </w:pPr>
       <w:r>
         <w:t>INFORMAÇÕES ADICIONAIS</w:t>
@@ -652,53 +1126,64 @@
     </w:p>
     <w:p>
       <w:pPr>
-        <w:pStyle w:val="ListBullet"/>
-        <w:spacing w:after="44" w:line="245" w:lineRule="auto"/>
+        <w:spacing w:after="36" w:line="240" w:lineRule="auto"/>
         <w:keepLines/>
       </w:pPr>
       <w:r>
         <w:rPr>
           <w:rFonts w:ascii="Arial" w:hAnsi="Arial"/>
-          <w:color w:val="1C1F24"/>
+          <w:b/>
+          <w:i w:val="0"/>
+          <w:color w:val="000000"/>
           <w:sz w:val="18"/>
+          <w:u w:val="none"/>
         </w:rPr>
-        <w:t>Idiomas: Português nativo e inglês técnico para documentação, APIs, RFCs e comunicação escrita de desenvolvimento.</w:t>
+        <w:t xml:space="preserve">Idiomas: </w:t>
+      </w:r>
+      <w:r>
+        <w:rPr>
+          <w:rFonts w:ascii="Arial" w:hAnsi="Arial"/>
+          <w:b w:val="0"/>
+          <w:i w:val="0"/>
+          <w:color w:val="000000"/>
+          <w:sz w:val="18"/>
+          <w:u w:val="none"/>
+        </w:rPr>
+        <w:t>Português nativo; inglês técnico para documentação, APIs, RFCs, código e commits.</w:t>
       </w:r>
     </w:p>
     <w:p>
       <w:pPr>
-        <w:pStyle w:val="ListBullet"/>
-        <w:spacing w:after="44" w:line="245" w:lineRule="auto"/>
+        <w:spacing w:after="36" w:line="240" w:lineRule="auto"/>
         <w:keepLines/>
       </w:pPr>
       <w:r>
         <w:rPr>
           <w:rFonts w:ascii="Arial" w:hAnsi="Arial"/>
-          <w:color w:val="1C1F24"/>
+          <w:b/>
+          <w:i w:val="0"/>
+          <w:color w:val="000000"/>
           <w:sz w:val="18"/>
+          <w:u w:val="none"/>
         </w:rPr>
-        <w:t>Modalidade: remoto ou híbrido, com disponibilidade para viagens pontuais.</w:t>
+        <w:t xml:space="preserve">Modalidade: </w:t>
       </w:r>
-    </w:p>
-    <w:p>
-      <w:pPr>
-        <w:pStyle w:val="ListBullet"/>
-        <w:spacing w:after="44" w:line="245" w:lineRule="auto"/>
-        <w:keepLines/>
-      </w:pPr>
       <w:r>
         <w:rPr>
           <w:rFonts w:ascii="Arial" w:hAnsi="Arial"/>
-          <w:color w:val="1C1F24"/>
+          <w:b w:val="0"/>
+          <w:i w:val="0"/>
+          <w:color w:val="000000"/>
           <w:sz w:val="18"/>
+          <w:u w:val="none"/>
         </w:rPr>
-        <w:t>Interesses: produtos SaaS, arquitetura de sistemas, automação de processos, IA aplicada e integrações.</w:t>
+        <w:t>remoto ou híbrido, com disponibilidade para viagens pontuais.</w:t>
       </w:r>
     </w:p>
     <w:sectPr>
-      <w:footerReference w:type="default" r:id="rId9"/>
+      <w:footerReference w:type="default" r:id="rId12"/>
       <w:pgSz w:w="12240" w:h="15840"/>
-      <w:pgMar w:top="749" w:right="893" w:bottom="720" w:left="893" w:header="360" w:footer="360" w:gutter="0"/>
+      <w:pgMar w:top="691" w:right="893" w:bottom="648" w:left="893" w:header="317" w:footer="317" w:gutter="0"/>
       <w:cols w:space="720"/>
       <w:docGrid w:linePitch="360"/>
     </w:sectPr>
@@ -718,10 +1203,12 @@
       <w:rPr>
         <w:rFonts w:ascii="Arial" w:hAnsi="Arial"/>
         <w:b w:val="0"/>
-        <w:color w:val="555B63"/>
+        <w:i w:val="0"/>
+        <w:color w:val="2D2D2D"/>
         <w:sz w:val="16"/>
-      </w:rPr>
-      <w:t>Iury Henrique  ·  Full Stack, SaaS e Automação</w:t>
+        <w:u w:val="none"/>
+      </w:rPr>
+      <w:t>Iury Henrique | Desenvolvedor Full Stack</w:t>
     </w:r>
   </w:p>
 </w:ftr>
@@ -1091,11 +1578,11 @@
     <w:qFormat/>
     <w:rsid w:val="00FC693F"/>
     <w:pPr>
-      <w:spacing w:before="0" w:after="60" w:line="247" w:lineRule="auto"/>
+      <w:spacing w:before="0" w:after="50" w:line="240" w:lineRule="auto"/>
     </w:pPr>
     <w:rPr>
       <w:rFonts w:ascii="Arial" w:hAnsi="Arial"/>
-      <w:color w:val="1C1F24"/>
+      <w:color w:val="000000"/>
       <w:sz w:val="18"/>
     </w:rPr>
   </w:style>
@@ -1154,15 +1641,15 @@
     <w:pPr>
       <w:keepNext/>
       <w:keepLines/>
-      <w:spacing w:before="140" w:after="80"/>
+      <w:spacing w:before="480" w:after="0"/>
       <w:outlineLvl w:val="0"/>
     </w:pPr>
     <w:rPr>
       <w:rFonts w:asciiTheme="majorHAnsi" w:eastAsiaTheme="majorEastAsia" w:hAnsiTheme="majorHAnsi" w:cstheme="majorBidi" w:ascii="Arial" w:hAnsi="Arial"/>
       <w:b/>
       <w:bCs/>
-      <w:color w:val="1C1F24"/>
-      <w:sz w:val="22"/>
+      <w:color w:val="000000"/>
+      <w:sz w:val="21"/>
       <w:szCs w:val="28"/>
     </w:rPr>
   </w:style>
@@ -1625,13 +2112,13 @@
       <w:numPr>
         <w:numId w:val="1"/>
       </w:numPr>
-      <w:spacing w:after="44" w:line="245" w:lineRule="auto"/>
-      <w:ind w:left="317" w:hanging="173"/>
+      <w:spacing w:after="34"/>
+      <w:ind w:left="331" w:hanging="187"/>
       <w:contextualSpacing/>
     </w:pPr>
     <w:rPr>
       <w:rFonts w:ascii="Arial" w:hAnsi="Arial"/>
-      <w:color w:val="1C1F24"/>
+      <w:color w:val="000000"/>
       <w:sz w:val="18"/>
     </w:rPr>
   </w:style>

</xml_diff>